<commit_message>
Update project report with team details and submission information
</commit_message>
<xml_diff>
--- a/CSE421_Lab_Project_report (Edit this).docx
+++ b/CSE421_Lab_Project_report (Edit this).docx
@@ -7,13 +7,120 @@
         <w:pStyle w:val="Title"/>
         <w:bidi w:val="0"/>
         <w:spacing w:before="240" w:after="120"/>
-        <w:rPr/>
-      </w:pPr>
-      <w:r>
-        <w:rPr/>
-        <w:t>CSE421 (Computer Networks)</w:t>
-      </w:r>
-      <w:r>
+        <w:rPr>
+          <w:rFonts w:ascii="Arial" w:hAnsi="Arial"/>
+        </w:rPr>
+      </w:pPr>
+      <w:r>
+        <w:rPr>
+          <w:rFonts w:ascii="Arial" w:hAnsi="Arial"/>
+        </w:rPr>
+        <w:drawing>
+          <wp:anchor distT="0" distB="0" distL="0" distR="0" simplePos="0" relativeHeight="4" behindDoc="0" locked="0" layoutInCell="0" allowOverlap="1">
+            <wp:simplePos x="0" y="0"/>
+            <wp:positionH relativeFrom="column">
+              <wp:align>center</wp:align>
+            </wp:positionH>
+            <wp:positionV relativeFrom="paragraph">
+              <wp:posOffset>635</wp:posOffset>
+            </wp:positionV>
+            <wp:extent cx="1751965" cy="1607185"/>
+            <wp:effectExtent l="0" t="0" r="0" b="0"/>
+            <wp:wrapSquare wrapText="largest"/>
+            <wp:docPr id="1" name="Image1"/>
+            <wp:cNvGraphicFramePr>
+              <a:graphicFrameLocks xmlns:a="http://schemas.openxmlformats.org/drawingml/2006/main" noChangeAspect="1"/>
+            </wp:cNvGraphicFramePr>
+            <a:graphic xmlns:a="http://schemas.openxmlformats.org/drawingml/2006/main">
+              <a:graphicData uri="http://schemas.openxmlformats.org/drawingml/2006/picture">
+                <pic:pic xmlns:pic="http://schemas.openxmlformats.org/drawingml/2006/picture">
+                  <pic:nvPicPr>
+                    <pic:cNvPr id="1" name="Image1"/>
+                    <pic:cNvPicPr>
+                      <a:picLocks noChangeAspect="1" noChangeArrowheads="1"/>
+                    </pic:cNvPicPr>
+                  </pic:nvPicPr>
+                  <pic:blipFill>
+                    <a:blip r:embed="rId2"/>
+                    <a:stretch>
+                      <a:fillRect/>
+                    </a:stretch>
+                  </pic:blipFill>
+                  <pic:spPr bwMode="auto">
+                    <a:xfrm>
+                      <a:off x="0" y="0"/>
+                      <a:ext cx="1751965" cy="1607185"/>
+                    </a:xfrm>
+                    <a:prstGeom prst="rect">
+                      <a:avLst/>
+                    </a:prstGeom>
+                    <a:noFill/>
+                  </pic:spPr>
+                </pic:pic>
+              </a:graphicData>
+            </a:graphic>
+          </wp:anchor>
+        </w:drawing>
+      </w:r>
+    </w:p>
+    <w:p>
+      <w:pPr>
+        <w:pStyle w:val="Title"/>
+        <w:bidi w:val="0"/>
+        <w:spacing w:before="240" w:after="120"/>
+        <w:rPr>
+          <w:rFonts w:ascii="Arial" w:hAnsi="Arial"/>
+        </w:rPr>
+      </w:pPr>
+      <w:r>
+        <w:rPr>
+          <w:rFonts w:ascii="Arial" w:hAnsi="Arial"/>
+        </w:rPr>
+      </w:r>
+    </w:p>
+    <w:p>
+      <w:pPr>
+        <w:pStyle w:val="Title"/>
+        <w:bidi w:val="0"/>
+        <w:spacing w:before="240" w:after="120"/>
+        <w:rPr>
+          <w:rFonts w:ascii="Arial" w:hAnsi="Arial"/>
+        </w:rPr>
+      </w:pPr>
+      <w:r>
+        <w:rPr>
+          <w:rFonts w:ascii="Arial" w:hAnsi="Arial"/>
+        </w:rPr>
+      </w:r>
+    </w:p>
+    <w:p>
+      <w:pPr>
+        <w:pStyle w:val="Title"/>
+        <w:bidi w:val="0"/>
+        <w:spacing w:before="240" w:after="120"/>
+        <w:rPr>
+          <w:rFonts w:ascii="Arial" w:hAnsi="Arial"/>
+        </w:rPr>
+      </w:pPr>
+      <w:r>
+        <w:rPr>
+          <w:rFonts w:ascii="Arial" w:hAnsi="Arial"/>
+        </w:rPr>
+      </w:r>
+    </w:p>
+    <w:p>
+      <w:pPr>
+        <w:pStyle w:val="Title"/>
+        <w:bidi w:val="0"/>
+        <w:spacing w:before="240" w:after="120"/>
+        <w:rPr>
+          <w:rFonts w:ascii="Arial" w:hAnsi="Arial"/>
+        </w:rPr>
+      </w:pPr>
+      <w:r>
+        <w:rPr>
+          <w:rFonts w:ascii="Arial" w:hAnsi="Arial"/>
+        </w:rPr>
         <mc:AlternateContent>
           <mc:Choice Requires="wps">
             <w:drawing>
@@ -28,26 +135,30 @@
                 <wp:extent cx="266700" cy="266700"/>
                 <wp:effectExtent l="0" t="0" r="0" b="0"/>
                 <wp:wrapNone/>
-                <wp:docPr id="1" name="user-content--team-members--contributions"/>
+                <wp:docPr id="2" name="user-content--team-members--contributions"/>
                 <a:graphic xmlns:a="http://schemas.openxmlformats.org/drawingml/2006/main">
                   <a:graphicData uri="http://schemas.microsoft.com/office/word/2010/wordprocessingShape">
                     <wps:wsp>
-                      <wps:cNvSpPr txBox="1"/>
+                      <wps:cNvSpPr/>
                       <wps:spPr>
                         <a:xfrm>
                           <a:off x="0" y="0"/>
-                          <a:ext cx="266700" cy="266700"/>
+                          <a:ext cx="266760" cy="266760"/>
                         </a:xfrm>
-                        <a:prstGeom prst="rect"/>
-                        <a:solidFill>
-                          <a:srgbClr val="FFFFFF"/>
-                        </a:solidFill>
-                        <a:solidFill>
-                          <a:srgbClr val="000000">
-                            <a:alpha val="0"/>
-                          </a:srgbClr>
-                        </a:solidFill>
+                        <a:prstGeom prst="rect">
+                          <a:avLst/>
+                        </a:prstGeom>
+                        <a:noFill/>
+                        <a:ln w="0">
+                          <a:noFill/>
+                        </a:ln>
                       </wps:spPr>
+                      <wps:style>
+                        <a:lnRef idx="0"/>
+                        <a:fillRef idx="0"/>
+                        <a:effectRef idx="0"/>
+                        <a:fontRef idx="minor"/>
+                      </wps:style>
                       <wps:txbx>
                         <w:txbxContent>
                           <w:p>
@@ -65,7 +176,7 @@
                           </w:p>
                         </w:txbxContent>
                       </wps:txbx>
-                      <wps:bodyPr anchor="t" lIns="0" tIns="0" rIns="0" bIns="0">
+                      <wps:bodyPr lIns="0" tIns="0" rIns="0" bIns="0" anchor="t">
                         <a:noAutofit/>
                       </wps:bodyPr>
                     </wps:wsp>
@@ -76,9 +187,10 @@
           </mc:Choice>
           <mc:Fallback>
             <w:pict>
-              <v:rect fillcolor="#000000" style="position:absolute;rotation:-0;width:21pt;height:21pt;mso-wrap-distance-left:0pt;mso-wrap-distance-right:0pt;mso-wrap-distance-top:0pt;mso-wrap-distance-bottom:0pt;margin-top:14.25pt;mso-position-vertical-relative:text;margin-left:-21pt;mso-position-horizontal-relative:text">
-                <v:fill opacity="0f"/>
-                <v:textbox inset="0in,0in,0in,0in">
+              <v:rect id="shape_0" fillcolor="black" stroked="f" o:allowincell="f" style="position:absolute;margin-left:-21pt;margin-top:14.25pt;width:20.95pt;height:20.95pt;mso-wrap-style:none;v-text-anchor:middle">
+                <v:fill o:detectmouseclick="t" type="solid" color2="white" opacity="0"/>
+                <v:stroke color="#3465a4" joinstyle="round" endcap="flat"/>
+                <v:textbox>
                   <w:txbxContent>
                     <w:p>
                       <w:pPr>
@@ -101,31 +213,45 @@
           </mc:Fallback>
         </mc:AlternateContent>
       </w:r>
-    </w:p>
-    <w:p>
-      <w:pPr>
-        <w:pStyle w:val="Normal"/>
-        <w:bidi w:val="0"/>
-        <w:jc w:val="start"/>
-        <w:rPr/>
-      </w:pPr>
-      <w:r>
-        <w:rPr/>
+      <w:r>
+        <w:rPr>
+          <w:rFonts w:ascii="Arial" w:hAnsi="Arial"/>
+        </w:rPr>
+        <w:t>CSE421 (Computer Networks)</w:t>
+      </w:r>
+    </w:p>
+    <w:p>
+      <w:pPr>
+        <w:pStyle w:val="Normal"/>
+        <w:bidi w:val="0"/>
+        <w:jc w:val="start"/>
+        <w:rPr>
+          <w:rFonts w:ascii="Arial" w:hAnsi="Arial"/>
+        </w:rPr>
+      </w:pPr>
+      <w:r>
+        <w:rPr>
+          <w:rFonts w:ascii="Arial" w:hAnsi="Arial"/>
+        </w:rPr>
       </w:r>
     </w:p>
     <w:p>
       <w:pPr>
         <w:pStyle w:val="Subtitle"/>
         <w:bidi w:val="0"/>
-        <w:rPr/>
-      </w:pPr>
-      <w:r>
-        <w:rPr/>
+        <w:rPr>
+          <w:rFonts w:ascii="Arial" w:hAnsi="Arial"/>
+        </w:rPr>
+      </w:pPr>
+      <w:r>
+        <w:rPr>
+          <w:rFonts w:ascii="Arial" w:hAnsi="Arial"/>
+        </w:rPr>
         <w:t xml:space="preserve">Project: </w:t>
       </w:r>
       <w:r>
         <w:rPr>
-          <w:rFonts w:ascii="Mona Sans VF;apple-system;BlinkMacSystemFont;Segoe UI;Noto Sans Backtick Fix;Noto Sans;Helvetica;Arial;sans-serif;Apple Color Emoji;Segoe UI Emoji" w:hAnsi="Mona Sans VF;apple-system;BlinkMacSystemFont;Segoe UI;Noto Sans Backtick Fix;Noto Sans;Helvetica;Arial;sans-serif;Apple Color Emoji;Segoe UI Emoji"/>
+          <w:rFonts w:ascii="Arial" w:hAnsi="Arial"/>
           <w:b w:val="false"/>
           <w:i w:val="false"/>
           <w:caps w:val="false"/>
@@ -140,67 +266,128 @@
         <w:pStyle w:val="Normal"/>
         <w:bidi w:val="0"/>
         <w:jc w:val="start"/>
-        <w:rPr/>
-      </w:pPr>
-      <w:r>
-        <w:rPr/>
-      </w:r>
-    </w:p>
-    <w:p>
-      <w:pPr>
-        <w:pStyle w:val="Normal"/>
-        <w:bidi w:val="0"/>
-        <w:jc w:val="start"/>
-        <w:rPr/>
-      </w:pPr>
-      <w:r>
-        <w:rPr/>
-      </w:r>
-    </w:p>
-    <w:p>
-      <w:pPr>
-        <w:pStyle w:val="Normal"/>
-        <w:bidi w:val="0"/>
-        <w:jc w:val="start"/>
-        <w:rPr/>
-      </w:pPr>
-      <w:r>
-        <w:rPr/>
-      </w:r>
-    </w:p>
-    <w:p>
-      <w:pPr>
-        <w:pStyle w:val="Normal"/>
-        <w:bidi w:val="0"/>
-        <w:jc w:val="start"/>
-        <w:rPr/>
-      </w:pPr>
-      <w:r>
-        <w:rPr/>
-      </w:r>
-    </w:p>
-    <w:p>
-      <w:pPr>
-        <w:pStyle w:val="Normal"/>
-        <w:bidi w:val="0"/>
-        <w:jc w:val="start"/>
-        <w:rPr/>
-      </w:pPr>
-      <w:r>
-        <w:rPr/>
-      </w:r>
-    </w:p>
-    <w:p>
-      <w:pPr>
-        <w:pStyle w:val="Normal"/>
-        <w:bidi w:val="0"/>
-        <w:spacing w:lineRule="auto" w:line="480"/>
-        <w:jc w:val="start"/>
-        <w:rPr/>
-      </w:pPr>
-      <w:r>
-        <w:rPr/>
-        <w:t>Team Members &amp; Contributions</w:t>
+        <w:rPr>
+          <w:rFonts w:ascii="Arial" w:hAnsi="Arial"/>
+        </w:rPr>
+      </w:pPr>
+      <w:r>
+        <w:rPr>
+          <w:rFonts w:ascii="Arial" w:hAnsi="Arial"/>
+        </w:rPr>
+      </w:r>
+    </w:p>
+    <w:p>
+      <w:pPr>
+        <w:pStyle w:val="Normal"/>
+        <w:bidi w:val="0"/>
+        <w:jc w:val="start"/>
+        <w:rPr>
+          <w:rFonts w:ascii="Arial" w:hAnsi="Arial"/>
+        </w:rPr>
+      </w:pPr>
+      <w:r>
+        <w:rPr>
+          <w:rFonts w:ascii="Arial" w:hAnsi="Arial"/>
+        </w:rPr>
+      </w:r>
+    </w:p>
+    <w:p>
+      <w:pPr>
+        <w:pStyle w:val="Normal"/>
+        <w:bidi w:val="0"/>
+        <w:jc w:val="start"/>
+        <w:rPr>
+          <w:rFonts w:ascii="Arial" w:hAnsi="Arial"/>
+        </w:rPr>
+      </w:pPr>
+      <w:r>
+        <w:rPr>
+          <w:rFonts w:ascii="Arial" w:hAnsi="Arial"/>
+        </w:rPr>
+      </w:r>
+    </w:p>
+    <w:p>
+      <w:pPr>
+        <w:pStyle w:val="Normal"/>
+        <w:bidi w:val="0"/>
+        <w:jc w:val="start"/>
+        <w:rPr>
+          <w:rFonts w:ascii="Arial" w:hAnsi="Arial"/>
+        </w:rPr>
+      </w:pPr>
+      <w:r>
+        <w:rPr>
+          <w:rFonts w:ascii="Arial" w:hAnsi="Arial"/>
+        </w:rPr>
+      </w:r>
+    </w:p>
+    <w:p>
+      <w:pPr>
+        <w:pStyle w:val="Normal"/>
+        <w:bidi w:val="0"/>
+        <w:jc w:val="start"/>
+        <w:rPr>
+          <w:rFonts w:ascii="Arial" w:hAnsi="Arial"/>
+        </w:rPr>
+      </w:pPr>
+      <w:r>
+        <w:rPr>
+          <w:rFonts w:ascii="Arial" w:hAnsi="Arial"/>
+        </w:rPr>
+      </w:r>
+    </w:p>
+    <w:p>
+      <w:pPr>
+        <w:pStyle w:val="Normal"/>
+        <w:bidi w:val="0"/>
+        <w:spacing w:lineRule="auto" w:line="360"/>
+        <w:jc w:val="start"/>
+        <w:rPr>
+          <w:rFonts w:ascii="Arial" w:hAnsi="Arial"/>
+        </w:rPr>
+      </w:pPr>
+      <w:r>
+        <w:rPr>
+          <w:rFonts w:ascii="Arial" w:hAnsi="Arial"/>
+          <w:b/>
+          <w:bCs/>
+        </w:rPr>
+        <w:t>Group</w:t>
+      </w:r>
+      <w:r>
+        <w:rPr>
+          <w:rFonts w:ascii="Arial" w:hAnsi="Arial"/>
+        </w:rPr>
+        <w:t>: 1501</w:t>
+      </w:r>
+    </w:p>
+    <w:p>
+      <w:pPr>
+        <w:pStyle w:val="Normal"/>
+        <w:bidi w:val="0"/>
+        <w:spacing w:lineRule="auto" w:line="360"/>
+        <w:jc w:val="start"/>
+        <w:rPr>
+          <w:rFonts w:ascii="Arial" w:hAnsi="Arial"/>
+          <w:b/>
+          <w:bCs/>
+        </w:rPr>
+      </w:pPr>
+      <w:r>
+        <w:rPr>
+          <w:rFonts w:ascii="Arial" w:hAnsi="Arial"/>
+          <w:b/>
+          <w:bCs/>
+        </w:rPr>
+        <w:t>Team Members</w:t>
+      </w:r>
+      <w:r>
+        <w:rPr>
+          <w:rFonts w:ascii="Arial" w:hAnsi="Arial"/>
+          <w:b w:val="false"/>
+          <w:bCs w:val="false"/>
+        </w:rPr>
+        <w:t>:</w:t>
       </w:r>
     </w:p>
     <w:p>
@@ -211,13 +398,16 @@
           <w:numId w:val="2"/>
         </w:numPr>
         <w:bidi w:val="0"/>
-        <w:spacing w:lineRule="auto" w:line="480"/>
+        <w:spacing w:lineRule="auto" w:line="360"/>
         <w:jc w:val="start"/>
         <w:rPr/>
       </w:pPr>
       <w:r>
         <w:rPr>
           <w:rStyle w:val="Strong"/>
+          <w:rFonts w:ascii="Arial" w:hAnsi="Arial"/>
+          <w:b w:val="false"/>
+          <w:bCs w:val="false"/>
         </w:rPr>
         <w:t>Afaf Binta Shamsuddin (ID: 22101844)</w:t>
       </w:r>
@@ -230,13 +420,16 @@
           <w:numId w:val="2"/>
         </w:numPr>
         <w:bidi w:val="0"/>
-        <w:spacing w:lineRule="auto" w:line="480"/>
+        <w:spacing w:lineRule="auto" w:line="360"/>
         <w:jc w:val="start"/>
         <w:rPr/>
       </w:pPr>
       <w:r>
         <w:rPr>
           <w:rStyle w:val="Strong"/>
+          <w:rFonts w:ascii="Arial" w:hAnsi="Arial"/>
+          <w:b w:val="false"/>
+          <w:bCs w:val="false"/>
         </w:rPr>
         <w:t>Dipannita Banik (ID: 24301043)</w:t>
       </w:r>
@@ -249,13 +442,16 @@
           <w:numId w:val="2"/>
         </w:numPr>
         <w:bidi w:val="0"/>
-        <w:spacing w:lineRule="auto" w:line="480"/>
+        <w:spacing w:lineRule="auto" w:line="360"/>
         <w:jc w:val="start"/>
         <w:rPr/>
       </w:pPr>
       <w:r>
         <w:rPr>
           <w:rStyle w:val="Strong"/>
+          <w:rFonts w:ascii="Arial" w:hAnsi="Arial"/>
+          <w:b w:val="false"/>
+          <w:bCs w:val="false"/>
         </w:rPr>
         <w:t>Syed Isfar Rahman (ID: 22201312)</w:t>
       </w:r>
@@ -268,13 +464,16 @@
           <w:numId w:val="2"/>
         </w:numPr>
         <w:bidi w:val="0"/>
-        <w:spacing w:lineRule="auto" w:line="480"/>
+        <w:spacing w:lineRule="auto" w:line="360"/>
         <w:jc w:val="start"/>
         <w:rPr/>
       </w:pPr>
       <w:r>
         <w:rPr>
           <w:rStyle w:val="Strong"/>
+          <w:rFonts w:ascii="Arial" w:hAnsi="Arial"/>
+          <w:b w:val="false"/>
+          <w:bCs w:val="false"/>
         </w:rPr>
         <w:t>MD. Aminul Islam Ornab (ID: 22101569)</w:t>
       </w:r>
@@ -283,37 +482,477 @@
       <w:pPr>
         <w:pStyle w:val="Normal"/>
         <w:bidi w:val="0"/>
-        <w:jc w:val="start"/>
-        <w:rPr>
-          <w:rStyle w:val="Strong"/>
-        </w:rPr>
-      </w:pPr>
-      <w:r>
-        <w:rPr/>
-      </w:r>
-    </w:p>
-    <w:p>
-      <w:pPr>
-        <w:pStyle w:val="Normal"/>
-        <w:bidi w:val="0"/>
-        <w:jc w:val="start"/>
-        <w:rPr>
-          <w:rStyle w:val="Strong"/>
-        </w:rPr>
-      </w:pPr>
-      <w:r>
-        <w:rPr/>
-      </w:r>
-    </w:p>
-    <w:p>
-      <w:pPr>
-        <w:pStyle w:val="Normal"/>
-        <w:bidi w:val="0"/>
-        <w:jc w:val="start"/>
-        <w:rPr/>
-      </w:pPr>
-      <w:r>
-        <w:rPr/>
+        <w:spacing w:lineRule="auto" w:line="360"/>
+        <w:jc w:val="start"/>
+        <w:rPr>
+          <w:rFonts w:ascii="Arial" w:hAnsi="Arial"/>
+          <w:b/>
+          <w:bCs/>
+        </w:rPr>
+      </w:pPr>
+      <w:r>
+        <w:rPr>
+          <w:rFonts w:ascii="Arial" w:hAnsi="Arial"/>
+          <w:b/>
+          <w:bCs/>
+        </w:rPr>
+        <w:t>Submission Date: XYZ</w:t>
+      </w:r>
+    </w:p>
+    <w:p>
+      <w:pPr>
+        <w:pStyle w:val="Normal"/>
+        <w:bidi w:val="0"/>
+        <w:spacing w:lineRule="auto" w:line="360"/>
+        <w:jc w:val="start"/>
+        <w:rPr>
+          <w:rFonts w:ascii="Arial" w:hAnsi="Arial"/>
+          <w:b/>
+          <w:bCs/>
+        </w:rPr>
+      </w:pPr>
+      <w:r>
+        <w:rPr>
+          <w:rFonts w:ascii="Arial" w:hAnsi="Arial"/>
+          <w:b/>
+          <w:bCs/>
+        </w:rPr>
+        <w:t>Instructor Name:</w:t>
+      </w:r>
+    </w:p>
+    <w:p>
+      <w:pPr>
+        <w:pStyle w:val="Normal"/>
+        <w:bidi w:val="0"/>
+        <w:jc w:val="start"/>
+        <w:rPr>
+          <w:rFonts w:ascii="Arial" w:hAnsi="Arial"/>
+        </w:rPr>
+      </w:pPr>
+      <w:r>
+        <w:rPr>
+          <w:rFonts w:ascii="Arial" w:hAnsi="Arial"/>
+        </w:rPr>
+      </w:r>
+    </w:p>
+    <w:p>
+      <w:pPr>
+        <w:pStyle w:val="Normal"/>
+        <w:bidi w:val="0"/>
+        <w:jc w:val="start"/>
+        <w:rPr>
+          <w:rFonts w:ascii="Arial" w:hAnsi="Arial"/>
+        </w:rPr>
+      </w:pPr>
+      <w:r>
+        <w:rPr>
+          <w:rFonts w:ascii="Arial" w:hAnsi="Arial"/>
+        </w:rPr>
+      </w:r>
+    </w:p>
+    <w:p>
+      <w:pPr>
+        <w:pStyle w:val="Normal"/>
+        <w:bidi w:val="0"/>
+        <w:jc w:val="start"/>
+        <w:rPr>
+          <w:rFonts w:ascii="Arial" w:hAnsi="Arial"/>
+        </w:rPr>
+      </w:pPr>
+      <w:r>
+        <w:rPr>
+          <w:rFonts w:ascii="Arial" w:hAnsi="Arial"/>
+        </w:rPr>
+      </w:r>
+    </w:p>
+    <w:p>
+      <w:pPr>
+        <w:pStyle w:val="Normal"/>
+        <w:bidi w:val="0"/>
+        <w:jc w:val="start"/>
+        <w:rPr>
+          <w:rFonts w:ascii="Arial" w:hAnsi="Arial"/>
+        </w:rPr>
+      </w:pPr>
+      <w:r>
+        <w:rPr>
+          <w:rFonts w:ascii="Arial" w:hAnsi="Arial"/>
+        </w:rPr>
+      </w:r>
+    </w:p>
+    <w:p>
+      <w:pPr>
+        <w:pStyle w:val="Normal"/>
+        <w:bidi w:val="0"/>
+        <w:jc w:val="start"/>
+        <w:rPr>
+          <w:rFonts w:ascii="Arial" w:hAnsi="Arial"/>
+        </w:rPr>
+      </w:pPr>
+      <w:r>
+        <w:rPr>
+          <w:rFonts w:ascii="Arial" w:hAnsi="Arial"/>
+        </w:rPr>
+      </w:r>
+    </w:p>
+    <w:p>
+      <w:pPr>
+        <w:pStyle w:val="Normal"/>
+        <w:bidi w:val="0"/>
+        <w:jc w:val="start"/>
+        <w:rPr>
+          <w:rFonts w:ascii="Arial" w:hAnsi="Arial"/>
+        </w:rPr>
+      </w:pPr>
+      <w:r>
+        <w:rPr>
+          <w:rFonts w:ascii="Arial" w:hAnsi="Arial"/>
+        </w:rPr>
+      </w:r>
+    </w:p>
+    <w:p>
+      <w:pPr>
+        <w:pStyle w:val="Normal"/>
+        <w:bidi w:val="0"/>
+        <w:jc w:val="start"/>
+        <w:rPr>
+          <w:rFonts w:ascii="Arial" w:hAnsi="Arial"/>
+        </w:rPr>
+      </w:pPr>
+      <w:r>
+        <w:rPr>
+          <w:rFonts w:ascii="Arial" w:hAnsi="Arial"/>
+        </w:rPr>
+      </w:r>
+    </w:p>
+    <w:p>
+      <w:pPr>
+        <w:pStyle w:val="Normal"/>
+        <w:bidi w:val="0"/>
+        <w:jc w:val="start"/>
+        <w:rPr>
+          <w:rFonts w:ascii="Arial" w:hAnsi="Arial"/>
+        </w:rPr>
+      </w:pPr>
+      <w:r>
+        <w:rPr>
+          <w:rFonts w:ascii="Arial" w:hAnsi="Arial"/>
+        </w:rPr>
+      </w:r>
+    </w:p>
+    <w:p>
+      <w:pPr>
+        <w:pStyle w:val="Normal"/>
+        <w:bidi w:val="0"/>
+        <w:jc w:val="start"/>
+        <w:rPr>
+          <w:rFonts w:ascii="Arial" w:hAnsi="Arial"/>
+        </w:rPr>
+      </w:pPr>
+      <w:r>
+        <w:rPr>
+          <w:rFonts w:ascii="Arial" w:hAnsi="Arial"/>
+        </w:rPr>
+      </w:r>
+    </w:p>
+    <w:p>
+      <w:pPr>
+        <w:pStyle w:val="Normal"/>
+        <w:bidi w:val="0"/>
+        <w:jc w:val="start"/>
+        <w:rPr>
+          <w:rFonts w:ascii="Arial" w:hAnsi="Arial"/>
+        </w:rPr>
+      </w:pPr>
+      <w:r>
+        <w:rPr>
+          <w:rFonts w:ascii="Arial" w:hAnsi="Arial"/>
+        </w:rPr>
+      </w:r>
+    </w:p>
+    <w:p>
+      <w:pPr>
+        <w:pStyle w:val="Normal"/>
+        <w:bidi w:val="0"/>
+        <w:jc w:val="start"/>
+        <w:rPr>
+          <w:rFonts w:ascii="Arial" w:hAnsi="Arial"/>
+        </w:rPr>
+      </w:pPr>
+      <w:r>
+        <w:rPr>
+          <w:rFonts w:ascii="Arial" w:hAnsi="Arial"/>
+        </w:rPr>
+      </w:r>
+    </w:p>
+    <w:p>
+      <w:pPr>
+        <w:pStyle w:val="Normal"/>
+        <w:bidi w:val="0"/>
+        <w:jc w:val="start"/>
+        <w:rPr>
+          <w:rFonts w:ascii="Arial" w:hAnsi="Arial"/>
+        </w:rPr>
+      </w:pPr>
+      <w:r>
+        <w:rPr>
+          <w:rFonts w:ascii="Arial" w:hAnsi="Arial"/>
+        </w:rPr>
+      </w:r>
+    </w:p>
+    <w:p>
+      <w:pPr>
+        <w:pStyle w:val="Normal"/>
+        <w:bidi w:val="0"/>
+        <w:jc w:val="start"/>
+        <w:rPr>
+          <w:rFonts w:ascii="Arial" w:hAnsi="Arial"/>
+        </w:rPr>
+      </w:pPr>
+      <w:r>
+        <w:rPr>
+          <w:rFonts w:ascii="Arial" w:hAnsi="Arial"/>
+        </w:rPr>
+      </w:r>
+    </w:p>
+    <w:p>
+      <w:pPr>
+        <w:pStyle w:val="Normal"/>
+        <w:bidi w:val="0"/>
+        <w:jc w:val="start"/>
+        <w:rPr>
+          <w:rFonts w:ascii="Arial" w:hAnsi="Arial"/>
+        </w:rPr>
+      </w:pPr>
+      <w:r>
+        <w:rPr>
+          <w:rFonts w:ascii="Arial" w:hAnsi="Arial"/>
+        </w:rPr>
+      </w:r>
+    </w:p>
+    <w:p>
+      <w:pPr>
+        <w:pStyle w:val="Normal"/>
+        <w:bidi w:val="0"/>
+        <w:jc w:val="start"/>
+        <w:rPr>
+          <w:rFonts w:ascii="Arial" w:hAnsi="Arial"/>
+        </w:rPr>
+      </w:pPr>
+      <w:r>
+        <w:rPr>
+          <w:rFonts w:ascii="Arial" w:hAnsi="Arial"/>
+        </w:rPr>
+      </w:r>
+    </w:p>
+    <w:p>
+      <w:pPr>
+        <w:pStyle w:val="Normal"/>
+        <w:bidi w:val="0"/>
+        <w:jc w:val="start"/>
+        <w:rPr>
+          <w:rFonts w:ascii="Arial" w:hAnsi="Arial"/>
+        </w:rPr>
+      </w:pPr>
+      <w:r>
+        <w:rPr>
+          <w:rFonts w:ascii="Arial" w:hAnsi="Arial"/>
+        </w:rPr>
+      </w:r>
+    </w:p>
+    <w:p>
+      <w:pPr>
+        <w:pStyle w:val="Normal"/>
+        <w:bidi w:val="0"/>
+        <w:jc w:val="start"/>
+        <w:rPr>
+          <w:rFonts w:ascii="Arial" w:hAnsi="Arial"/>
+        </w:rPr>
+      </w:pPr>
+      <w:r>
+        <w:rPr>
+          <w:rFonts w:ascii="Arial" w:hAnsi="Arial"/>
+        </w:rPr>
+      </w:r>
+    </w:p>
+    <w:p>
+      <w:pPr>
+        <w:pStyle w:val="Normal"/>
+        <w:bidi w:val="0"/>
+        <w:jc w:val="start"/>
+        <w:rPr>
+          <w:rFonts w:ascii="Arial" w:hAnsi="Arial"/>
+        </w:rPr>
+      </w:pPr>
+      <w:r>
+        <w:rPr>
+          <w:rFonts w:ascii="Arial" w:hAnsi="Arial"/>
+        </w:rPr>
+      </w:r>
+    </w:p>
+    <w:p>
+      <w:pPr>
+        <w:pStyle w:val="Normal"/>
+        <w:bidi w:val="0"/>
+        <w:jc w:val="start"/>
+        <w:rPr>
+          <w:rFonts w:ascii="Arial" w:hAnsi="Arial"/>
+        </w:rPr>
+      </w:pPr>
+      <w:r>
+        <w:rPr>
+          <w:rFonts w:ascii="Arial" w:hAnsi="Arial"/>
+        </w:rPr>
+      </w:r>
+    </w:p>
+    <w:p>
+      <w:pPr>
+        <w:pStyle w:val="Normal"/>
+        <w:bidi w:val="0"/>
+        <w:jc w:val="start"/>
+        <w:rPr>
+          <w:rFonts w:ascii="Arial" w:hAnsi="Arial"/>
+        </w:rPr>
+      </w:pPr>
+      <w:r>
+        <w:rPr>
+          <w:rFonts w:ascii="Arial" w:hAnsi="Arial"/>
+        </w:rPr>
+      </w:r>
+    </w:p>
+    <w:p>
+      <w:pPr>
+        <w:pStyle w:val="Normal"/>
+        <w:bidi w:val="0"/>
+        <w:jc w:val="start"/>
+        <w:rPr>
+          <w:rFonts w:ascii="Arial" w:hAnsi="Arial"/>
+        </w:rPr>
+      </w:pPr>
+      <w:r>
+        <w:rPr>
+          <w:rFonts w:ascii="Arial" w:hAnsi="Arial"/>
+        </w:rPr>
+      </w:r>
+    </w:p>
+    <w:p>
+      <w:pPr>
+        <w:pStyle w:val="Normal"/>
+        <w:bidi w:val="0"/>
+        <w:jc w:val="start"/>
+        <w:rPr>
+          <w:rFonts w:ascii="Arial" w:hAnsi="Arial"/>
+        </w:rPr>
+      </w:pPr>
+      <w:r>
+        <w:rPr>
+          <w:rFonts w:ascii="Arial" w:hAnsi="Arial"/>
+        </w:rPr>
+      </w:r>
+    </w:p>
+    <w:p>
+      <w:pPr>
+        <w:pStyle w:val="Normal"/>
+        <w:bidi w:val="0"/>
+        <w:jc w:val="start"/>
+        <w:rPr>
+          <w:rFonts w:ascii="Arial" w:hAnsi="Arial"/>
+        </w:rPr>
+      </w:pPr>
+      <w:r>
+        <w:rPr>
+          <w:rFonts w:ascii="Arial" w:hAnsi="Arial"/>
+        </w:rPr>
+      </w:r>
+    </w:p>
+    <w:p>
+      <w:pPr>
+        <w:pStyle w:val="Normal"/>
+        <w:bidi w:val="0"/>
+        <w:jc w:val="start"/>
+        <w:rPr>
+          <w:rFonts w:ascii="Arial" w:hAnsi="Arial"/>
+        </w:rPr>
+      </w:pPr>
+      <w:r>
+        <w:rPr>
+          <w:rFonts w:ascii="Arial" w:hAnsi="Arial"/>
+        </w:rPr>
+      </w:r>
+    </w:p>
+    <w:p>
+      <w:pPr>
+        <w:pStyle w:val="Normal"/>
+        <w:bidi w:val="0"/>
+        <w:jc w:val="start"/>
+        <w:rPr>
+          <w:rFonts w:ascii="Arial" w:hAnsi="Arial"/>
+        </w:rPr>
+      </w:pPr>
+      <w:r>
+        <w:rPr>
+          <w:rFonts w:ascii="Arial" w:hAnsi="Arial"/>
+        </w:rPr>
+      </w:r>
+    </w:p>
+    <w:p>
+      <w:pPr>
+        <w:pStyle w:val="Normal"/>
+        <w:bidi w:val="0"/>
+        <w:jc w:val="start"/>
+        <w:rPr>
+          <w:rFonts w:ascii="Arial" w:hAnsi="Arial"/>
+        </w:rPr>
+      </w:pPr>
+      <w:r>
+        <w:rPr>
+          <w:rFonts w:ascii="Arial" w:hAnsi="Arial"/>
+        </w:rPr>
+      </w:r>
+    </w:p>
+    <w:p>
+      <w:pPr>
+        <w:pStyle w:val="Normal"/>
+        <w:bidi w:val="0"/>
+        <w:jc w:val="start"/>
+        <w:rPr>
+          <w:rFonts w:ascii="Arial" w:hAnsi="Arial"/>
+        </w:rPr>
+      </w:pPr>
+      <w:r>
+        <w:rPr>
+          <w:rFonts w:ascii="Arial" w:hAnsi="Arial"/>
+        </w:rPr>
+      </w:r>
+    </w:p>
+    <w:p>
+      <w:pPr>
+        <w:pStyle w:val="Normal"/>
+        <w:bidi w:val="0"/>
+        <w:jc w:val="start"/>
+        <w:rPr>
+          <w:rFonts w:ascii="Arial" w:hAnsi="Arial"/>
+        </w:rPr>
+      </w:pPr>
+      <w:r>
+        <w:rPr>
+          <w:rFonts w:ascii="Arial" w:hAnsi="Arial"/>
+        </w:rPr>
+      </w:r>
+    </w:p>
+    <w:p>
+      <w:pPr>
+        <w:pStyle w:val="Normal"/>
+        <w:bidi w:val="0"/>
+        <w:jc w:val="start"/>
+        <w:rPr>
+          <w:rFonts w:ascii="Arial" w:hAnsi="Arial"/>
+        </w:rPr>
+      </w:pPr>
+      <w:r>
+        <w:rPr>
+          <w:rFonts w:ascii="Arial" w:hAnsi="Arial"/>
+        </w:rPr>
       </w:r>
     </w:p>
     <w:sectPr>
@@ -323,6 +962,7 @@
       <w:pgNumType w:fmt="decimal"/>
       <w:formProt w:val="false"/>
       <w:textDirection w:val="lrTb"/>
+      <w:docGrid w:type="default" w:linePitch="100" w:charSpace="0"/>
     </w:sectPr>
   </w:body>
 </w:document>
@@ -334,58 +974,58 @@
     <w:lvl w:ilvl="0">
       <w:start w:val="1"/>
       <w:numFmt w:val="none"/>
-      <w:pStyle w:val="Heading1"/>
-      <w:suff w:val="nothing"/>
-      <w:lvlText w:val=""/>
-      <w:lvlJc w:val="start"/>
-      <w:pPr>
-        <w:tabs>
-          <w:tab w:val="num" w:pos="0"/>
-        </w:tabs>
-        <w:ind w:start="0" w:hanging="0"/>
-      </w:pPr>
+      <w:suff w:val="nothing"/>
+      <w:lvlText w:val=""/>
+      <w:lvlJc w:val="start"/>
+      <w:pPr>
+        <w:tabs>
+          <w:tab w:val="num" w:pos="0"/>
+        </w:tabs>
+        <w:ind w:start="0" w:hanging="0"/>
+      </w:pPr>
+      <w:rPr/>
     </w:lvl>
     <w:lvl w:ilvl="1">
       <w:start w:val="1"/>
       <w:numFmt w:val="none"/>
-      <w:pStyle w:val="Heading2"/>
-      <w:suff w:val="nothing"/>
-      <w:lvlText w:val=""/>
-      <w:lvlJc w:val="start"/>
-      <w:pPr>
-        <w:tabs>
-          <w:tab w:val="num" w:pos="0"/>
-        </w:tabs>
-        <w:ind w:start="0" w:hanging="0"/>
-      </w:pPr>
+      <w:suff w:val="nothing"/>
+      <w:lvlText w:val=""/>
+      <w:lvlJc w:val="start"/>
+      <w:pPr>
+        <w:tabs>
+          <w:tab w:val="num" w:pos="0"/>
+        </w:tabs>
+        <w:ind w:start="0" w:hanging="0"/>
+      </w:pPr>
+      <w:rPr/>
     </w:lvl>
     <w:lvl w:ilvl="2">
       <w:start w:val="1"/>
       <w:numFmt w:val="none"/>
-      <w:pStyle w:val="Heading3"/>
-      <w:suff w:val="nothing"/>
-      <w:lvlText w:val=""/>
-      <w:lvlJc w:val="start"/>
-      <w:pPr>
-        <w:tabs>
-          <w:tab w:val="num" w:pos="0"/>
-        </w:tabs>
-        <w:ind w:start="0" w:hanging="0"/>
-      </w:pPr>
+      <w:suff w:val="nothing"/>
+      <w:lvlText w:val=""/>
+      <w:lvlJc w:val="start"/>
+      <w:pPr>
+        <w:tabs>
+          <w:tab w:val="num" w:pos="0"/>
+        </w:tabs>
+        <w:ind w:start="0" w:hanging="0"/>
+      </w:pPr>
+      <w:rPr/>
     </w:lvl>
     <w:lvl w:ilvl="3">
       <w:start w:val="1"/>
       <w:numFmt w:val="none"/>
-      <w:pStyle w:val="Heading4"/>
-      <w:suff w:val="nothing"/>
-      <w:lvlText w:val=""/>
-      <w:lvlJc w:val="start"/>
-      <w:pPr>
-        <w:tabs>
-          <w:tab w:val="num" w:pos="0"/>
-        </w:tabs>
-        <w:ind w:start="0" w:hanging="0"/>
-      </w:pPr>
+      <w:suff w:val="nothing"/>
+      <w:lvlText w:val=""/>
+      <w:lvlJc w:val="start"/>
+      <w:pPr>
+        <w:tabs>
+          <w:tab w:val="num" w:pos="0"/>
+        </w:tabs>
+        <w:ind w:start="0" w:hanging="0"/>
+      </w:pPr>
+      <w:rPr/>
     </w:lvl>
     <w:lvl w:ilvl="4">
       <w:start w:val="1"/>
@@ -399,6 +1039,7 @@
         </w:tabs>
         <w:ind w:start="0" w:hanging="0"/>
       </w:pPr>
+      <w:rPr/>
     </w:lvl>
     <w:lvl w:ilvl="5">
       <w:start w:val="1"/>
@@ -412,6 +1053,7 @@
         </w:tabs>
         <w:ind w:start="0" w:hanging="0"/>
       </w:pPr>
+      <w:rPr/>
     </w:lvl>
     <w:lvl w:ilvl="6">
       <w:start w:val="1"/>
@@ -425,6 +1067,7 @@
         </w:tabs>
         <w:ind w:start="0" w:hanging="0"/>
       </w:pPr>
+      <w:rPr/>
     </w:lvl>
     <w:lvl w:ilvl="7">
       <w:start w:val="1"/>
@@ -438,6 +1081,7 @@
         </w:tabs>
         <w:ind w:start="0" w:hanging="0"/>
       </w:pPr>
+      <w:rPr/>
     </w:lvl>
     <w:lvl w:ilvl="8">
       <w:start w:val="1"/>
@@ -451,6 +1095,7 @@
         </w:tabs>
         <w:ind w:start="0" w:hanging="0"/>
       </w:pPr>
+      <w:rPr/>
     </w:lvl>
   </w:abstractNum>
   <w:abstractNum w:abstractNumId="2">
@@ -588,6 +1233,125 @@
       <w:rPr>
         <w:rFonts w:ascii="OpenSymbol" w:hAnsi="OpenSymbol" w:cs="OpenSymbol" w:hint="default"/>
       </w:rPr>
+    </w:lvl>
+  </w:abstractNum>
+  <w:abstractNum w:abstractNumId="3">
+    <w:lvl w:ilvl="0">
+      <w:start w:val="1"/>
+      <w:numFmt w:val="none"/>
+      <w:suff w:val="nothing"/>
+      <w:lvlText w:val=""/>
+      <w:lvlJc w:val="start"/>
+      <w:pPr>
+        <w:tabs>
+          <w:tab w:val="num" w:pos="0"/>
+        </w:tabs>
+        <w:ind w:start="0" w:hanging="0"/>
+      </w:pPr>
+    </w:lvl>
+    <w:lvl w:ilvl="1">
+      <w:start w:val="1"/>
+      <w:numFmt w:val="none"/>
+      <w:suff w:val="nothing"/>
+      <w:lvlText w:val=""/>
+      <w:lvlJc w:val="start"/>
+      <w:pPr>
+        <w:tabs>
+          <w:tab w:val="num" w:pos="0"/>
+        </w:tabs>
+        <w:ind w:start="0" w:hanging="0"/>
+      </w:pPr>
+    </w:lvl>
+    <w:lvl w:ilvl="2">
+      <w:start w:val="1"/>
+      <w:numFmt w:val="none"/>
+      <w:suff w:val="nothing"/>
+      <w:lvlText w:val=""/>
+      <w:lvlJc w:val="start"/>
+      <w:pPr>
+        <w:tabs>
+          <w:tab w:val="num" w:pos="0"/>
+        </w:tabs>
+        <w:ind w:start="0" w:hanging="0"/>
+      </w:pPr>
+    </w:lvl>
+    <w:lvl w:ilvl="3">
+      <w:start w:val="1"/>
+      <w:numFmt w:val="none"/>
+      <w:suff w:val="nothing"/>
+      <w:lvlText w:val=""/>
+      <w:lvlJc w:val="start"/>
+      <w:pPr>
+        <w:tabs>
+          <w:tab w:val="num" w:pos="0"/>
+        </w:tabs>
+        <w:ind w:start="0" w:hanging="0"/>
+      </w:pPr>
+    </w:lvl>
+    <w:lvl w:ilvl="4">
+      <w:start w:val="1"/>
+      <w:numFmt w:val="none"/>
+      <w:suff w:val="nothing"/>
+      <w:lvlText w:val=""/>
+      <w:lvlJc w:val="start"/>
+      <w:pPr>
+        <w:tabs>
+          <w:tab w:val="num" w:pos="0"/>
+        </w:tabs>
+        <w:ind w:start="0" w:hanging="0"/>
+      </w:pPr>
+    </w:lvl>
+    <w:lvl w:ilvl="5">
+      <w:start w:val="1"/>
+      <w:numFmt w:val="none"/>
+      <w:suff w:val="nothing"/>
+      <w:lvlText w:val=""/>
+      <w:lvlJc w:val="start"/>
+      <w:pPr>
+        <w:tabs>
+          <w:tab w:val="num" w:pos="0"/>
+        </w:tabs>
+        <w:ind w:start="0" w:hanging="0"/>
+      </w:pPr>
+    </w:lvl>
+    <w:lvl w:ilvl="6">
+      <w:start w:val="1"/>
+      <w:numFmt w:val="none"/>
+      <w:suff w:val="nothing"/>
+      <w:lvlText w:val=""/>
+      <w:lvlJc w:val="start"/>
+      <w:pPr>
+        <w:tabs>
+          <w:tab w:val="num" w:pos="0"/>
+        </w:tabs>
+        <w:ind w:start="0" w:hanging="0"/>
+      </w:pPr>
+    </w:lvl>
+    <w:lvl w:ilvl="7">
+      <w:start w:val="1"/>
+      <w:numFmt w:val="none"/>
+      <w:suff w:val="nothing"/>
+      <w:lvlText w:val=""/>
+      <w:lvlJc w:val="start"/>
+      <w:pPr>
+        <w:tabs>
+          <w:tab w:val="num" w:pos="0"/>
+        </w:tabs>
+        <w:ind w:start="0" w:hanging="0"/>
+      </w:pPr>
+    </w:lvl>
+    <w:lvl w:ilvl="8">
+      <w:start w:val="1"/>
+      <w:numFmt w:val="none"/>
+      <w:suff w:val="nothing"/>
+      <w:lvlText w:val=""/>
+      <w:lvlJc w:val="start"/>
+      <w:pPr>
+        <w:tabs>
+          <w:tab w:val="num" w:pos="0"/>
+        </w:tabs>
+        <w:ind w:start="0" w:hanging="0"/>
+      </w:pPr>
     </w:lvl>
   </w:abstractNum>
   <w:num w:numId="1">
@@ -595,6 +1359,9 @@
   </w:num>
   <w:num w:numId="2">
     <w:abstractNumId w:val="2"/>
+  </w:num>
+  <w:num w:numId="3">
+    <w:abstractNumId w:val="3"/>
   </w:num>
 </w:numbering>
 </file>
@@ -613,7 +1380,6 @@
     </w:rPrDefault>
     <w:pPrDefault>
       <w:pPr>
-        <w:widowControl/>
         <w:suppressAutoHyphens w:val="true"/>
       </w:pPr>
     </w:pPrDefault>
@@ -623,7 +1389,10 @@
     <w:qFormat/>
     <w:pPr>
       <w:widowControl/>
+      <w:suppressAutoHyphens w:val="true"/>
       <w:bidi w:val="0"/>
+      <w:spacing w:before="0" w:after="0"/>
+      <w:jc w:val="start"/>
     </w:pPr>
     <w:rPr>
       <w:rFonts w:ascii="Liberation Serif" w:hAnsi="Liberation Serif" w:eastAsia="NSimSun" w:cs="Arial"/>
@@ -710,8 +1479,8 @@
       <w:szCs w:val="26"/>
     </w:rPr>
   </w:style>
-  <w:style w:type="character" w:styleId="Bullets">
-    <w:name w:val="Bullets"/>
+  <w:style w:type="character" w:styleId="Bulletsuser">
+    <w:name w:val="Bullets (user)"/>
     <w:qFormat/>
     <w:rPr>
       <w:rFonts w:ascii="OpenSymbol" w:hAnsi="OpenSymbol" w:eastAsia="OpenSymbol" w:cs="OpenSymbol"/>
@@ -811,6 +1580,13 @@
       <w:sz w:val="56"/>
       <w:szCs w:val="56"/>
     </w:rPr>
+  </w:style>
+  <w:style w:type="paragraph" w:styleId="FrameContents">
+    <w:name w:val="Frame Contents"/>
+    <w:basedOn w:val="Normal"/>
+    <w:qFormat/>
+    <w:pPr/>
+    <w:rPr/>
   </w:style>
 </w:styles>
 </file>

</xml_diff>

<commit_message>
Refactor file structure for improved readability and maintainability
</commit_message>
<xml_diff>
--- a/CSE421_Lab_Project_report (Edit this).docx
+++ b/CSE421_Lab_Project_report (Edit this).docx
@@ -118,9 +118,6 @@
         </w:rPr>
       </w:pPr>
       <w:r>
-        <w:rPr>
-          <w:rFonts w:ascii="Arial" w:hAnsi="Arial"/>
-        </w:rPr>
         <mc:AlternateContent>
           <mc:Choice Requires="wps">
             <w:drawing>
@@ -168,10 +165,14 @@
                               <w:spacing w:before="0" w:after="140"/>
                               <w:ind w:hanging="0" w:start="0" w:end="0"/>
                               <w:jc w:val="start"/>
-                              <w:rPr/>
+                              <w:rPr>
+                                <w:color w:val="000000"/>
+                              </w:rPr>
                             </w:pPr>
                             <w:r>
-                              <w:rPr/>
+                              <w:rPr>
+                                <w:color w:val="000000"/>
+                              </w:rPr>
                             </w:r>
                           </w:p>
                         </w:txbxContent>
@@ -187,8 +188,8 @@
           </mc:Choice>
           <mc:Fallback>
             <w:pict>
-              <v:rect id="shape_0" fillcolor="black" stroked="f" o:allowincell="f" style="position:absolute;margin-left:-21pt;margin-top:14.25pt;width:20.95pt;height:20.95pt;mso-wrap-style:none;v-text-anchor:middle">
-                <v:fill o:detectmouseclick="t" type="solid" color2="white" opacity="0"/>
+              <v:rect id="shape_0" stroked="f" o:allowincell="f" style="position:absolute;margin-left:-21pt;margin-top:14.25pt;width:20.95pt;height:20.95pt;mso-wrap-style:none;v-text-anchor:middle">
+                <v:fill o:detectmouseclick="t" on="false"/>
                 <v:stroke color="#3465a4" joinstyle="round" endcap="flat"/>
                 <v:textbox>
                   <w:txbxContent>
@@ -199,10 +200,14 @@
                         <w:spacing w:before="0" w:after="140"/>
                         <w:ind w:hanging="0" w:start="0" w:end="0"/>
                         <w:jc w:val="start"/>
-                        <w:rPr/>
+                        <w:rPr>
+                          <w:color w:val="000000"/>
+                        </w:rPr>
                       </w:pPr>
                       <w:r>
-                        <w:rPr/>
+                        <w:rPr>
+                          <w:color w:val="000000"/>
+                        </w:rPr>
                       </w:r>
                     </w:p>
                   </w:txbxContent>
@@ -1479,8 +1484,8 @@
       <w:szCs w:val="26"/>
     </w:rPr>
   </w:style>
-  <w:style w:type="character" w:styleId="Bulletsuser">
-    <w:name w:val="Bullets (user)"/>
+  <w:style w:type="character" w:styleId="Bullets">
+    <w:name w:val="Bullets"/>
     <w:qFormat/>
     <w:rPr>
       <w:rFonts w:ascii="OpenSymbol" w:hAnsi="OpenSymbol" w:eastAsia="OpenSymbol" w:cs="OpenSymbol"/>
@@ -1580,6 +1585,13 @@
       <w:sz w:val="56"/>
       <w:szCs w:val="56"/>
     </w:rPr>
+  </w:style>
+  <w:style w:type="paragraph" w:styleId="FrameContentsuser">
+    <w:name w:val="Frame Contents (user)"/>
+    <w:basedOn w:val="Normal"/>
+    <w:qFormat/>
+    <w:pPr/>
+    <w:rPr/>
   </w:style>
   <w:style w:type="paragraph" w:styleId="FrameContents">
     <w:name w:val="Frame Contents"/>

</xml_diff>